<commit_message>
removed digital signatures from chapter 1 requirements
</commit_message>
<xml_diff>
--- a/01_Introduction/Chapter_1_Introduction Revised.docx
+++ b/01_Introduction/Chapter_1_Introduction Revised.docx
@@ -605,7 +605,7 @@
           <w:sz w:val="22"/>
           <w:szCs w:val="22"/>
         </w:rPr>
-        <w:t xml:space="preserve">Workplace mentors will have access to the relevant student submissions. They will be able to review the students’ daily documentation, verify the information and digitally sign or approve the required documents. The student will then be able to see whether the document has been approved, rejected or is still waiting for the mentor's response. </w:t>
+        <w:t xml:space="preserve">Workplace mentors will have access to the relevant student submissions. They will be able to review the students’ daily documentation, verify the information and approve the required documents. The student will then be able to see whether the document has been approved, rejected or is still waiting for the mentor's response. </w:t>
       </w:r>
     </w:p>
     <w:p>
@@ -997,7 +997,14 @@
           <w:sz w:val="22"/>
           <w:szCs w:val="22"/>
         </w:rPr>
-        <w:t xml:space="preserve">Digitally signing/verifying required documents. </w:t>
+        <w:t>V</w:t>
+      </w:r>
+      <w:r>
+        <w:rPr>
+          <w:sz w:val="22"/>
+          <w:szCs w:val="22"/>
+        </w:rPr>
+        <w:t xml:space="preserve">erifying required documents. </w:t>
       </w:r>
     </w:p>
     <w:p>

</xml_diff>